<commit_message>
modified:   "papers/ANALYSIS AND FORECASTING OF RARE EARTH METALS UTILIZATION IN HIGH-TECH INDUSTRIES/\320\220\320\275\320\260\320\273\320\270\320\267 \320\270 \320\277\321\200\320\276\320\263\320\275\320\276\320\267\320\270\321\200\320\276\320\262\320\260\320\275\320\270\320\265 \320\270\321\201\320\277\320\276\320\273\321\214\320\267\320\276\320\262\320\260\320\275\320\270\321\217 \321\200\320\265\320\264\320\272\320\276\320\267\320\265\320\274\320\265\320\273\321\214\320\275\321\213\321\205 \320\274\320\265\321\202\320\260\320\273\320\273\320\276\320\262 \320\262 \320\262\321\213\321\201\320\276\320\272\320\276\321\202\320\265\321\205\320\275\320\276\320\273\320\276\320\263\320\270\321\207\320\275\321\213\321\205 \320\276\321\202\321\200\320\260\321\201\320\273\321\217\321\205.docx"
</commit_message>
<xml_diff>
--- a/papers/ANALYSIS AND FORECASTING OF RARE EARTH METALS UTILIZATION IN HIGH-TECH INDUSTRIES/Анализ и прогнозирование использования редкоземельных металлов в высокотехнологичных отраслях.docx
+++ b/papers/ANALYSIS AND FORECASTING OF RARE EARTH METALS UTILIZATION IN HIGH-TECH INDUSTRIES/Анализ и прогнозирование использования редкоземельных металлов в высокотехнологичных отраслях.docx
@@ -4890,6 +4890,7 @@
         <w:jc w:val="both"/>
         <w:rPr>
           <w:rFonts w:cs="Times New Roman"/>
+          <w:lang w:val="ru-RU"/>
         </w:rPr>
       </w:pPr>
       <w:r>
@@ -4907,6 +4908,7 @@
         <w:jc w:val="both"/>
         <w:rPr>
           <w:rFonts w:cs="Times New Roman"/>
+          <w:lang w:val="ru-RU"/>
         </w:rPr>
       </w:pPr>
     </w:p>
@@ -5101,6 +5103,7 @@
         <w:jc w:val="both"/>
         <w:rPr>
           <w:rFonts w:cs="Times New Roman"/>
+          <w:lang w:val="ru-RU"/>
         </w:rPr>
       </w:pPr>
       <w:r>
@@ -5118,6 +5121,7 @@
         <w:jc w:val="both"/>
         <w:rPr>
           <w:rFonts w:cs="Times New Roman"/>
+          <w:lang w:val="ru-RU"/>
         </w:rPr>
       </w:pPr>
       <w:r>
@@ -5135,6 +5139,7 @@
         <w:jc w:val="both"/>
         <w:rPr>
           <w:rFonts w:cs="Times New Roman"/>
+          <w:lang w:val="ru-RU"/>
         </w:rPr>
       </w:pPr>
     </w:p>
@@ -5730,6 +5735,7 @@
         <w:jc w:val="both"/>
         <w:rPr>
           <w:rFonts w:cs="Times New Roman"/>
+          <w:lang w:val="ru-RU"/>
         </w:rPr>
       </w:pPr>
       <w:r>
@@ -5747,6 +5753,7 @@
         <w:jc w:val="both"/>
         <w:rPr>
           <w:rFonts w:cs="Times New Roman"/>
+          <w:lang w:val="ru-RU"/>
         </w:rPr>
       </w:pPr>
     </w:p>
@@ -5910,6 +5917,7 @@
         <w:jc w:val="both"/>
         <w:rPr>
           <w:rFonts w:cs="Times New Roman"/>
+          <w:lang w:val="ru-RU"/>
         </w:rPr>
       </w:pPr>
       <w:r>
@@ -5943,6 +5951,7 @@
         <w:jc w:val="both"/>
         <w:rPr>
           <w:rFonts w:cs="Times New Roman"/>
+          <w:lang w:val="ru-RU"/>
         </w:rPr>
       </w:pPr>
     </w:p>
@@ -6278,6 +6287,7 @@
         <w:jc w:val="both"/>
         <w:rPr>
           <w:rFonts w:cs="Times New Roman"/>
+          <w:lang w:val="ru-RU"/>
         </w:rPr>
       </w:pPr>
       <w:r>
@@ -6295,6 +6305,7 @@
         <w:jc w:val="both"/>
         <w:rPr>
           <w:rFonts w:cs="Times New Roman"/>
+          <w:lang w:val="ru-RU"/>
         </w:rPr>
       </w:pPr>
     </w:p>
@@ -6494,6 +6505,7 @@
         <w:jc w:val="both"/>
         <w:rPr>
           <w:rFonts w:cs="Times New Roman"/>
+          <w:lang w:val="ru-RU"/>
         </w:rPr>
       </w:pPr>
       <w:r>
@@ -6511,6 +6523,7 @@
         <w:jc w:val="both"/>
         <w:rPr>
           <w:rFonts w:cs="Times New Roman"/>
+          <w:lang w:val="ru-RU"/>
         </w:rPr>
       </w:pPr>
     </w:p>
@@ -6671,6 +6684,7 @@
         <w:jc w:val="both"/>
         <w:rPr>
           <w:rFonts w:cs="Times New Roman"/>
+          <w:lang w:val="ru-RU"/>
         </w:rPr>
       </w:pPr>
       <w:r>
@@ -6688,6 +6702,7 @@
         <w:jc w:val="both"/>
         <w:rPr>
           <w:rFonts w:cs="Times New Roman"/>
+          <w:lang w:val="ru-RU"/>
         </w:rPr>
       </w:pPr>
     </w:p>
@@ -7017,6 +7032,7 @@
         <w:jc w:val="both"/>
         <w:rPr>
           <w:rFonts w:cs="Times New Roman"/>
+          <w:lang w:val="ru-RU"/>
         </w:rPr>
       </w:pPr>
       <w:r>
@@ -7034,6 +7050,7 @@
         <w:jc w:val="both"/>
         <w:rPr>
           <w:rFonts w:cs="Times New Roman"/>
+          <w:lang w:val="ru-RU"/>
         </w:rPr>
       </w:pPr>
     </w:p>
@@ -7194,6 +7211,7 @@
         <w:jc w:val="both"/>
         <w:rPr>
           <w:rFonts w:cs="Times New Roman"/>
+          <w:lang w:val="ru-RU"/>
         </w:rPr>
       </w:pPr>
       <w:r>
@@ -7211,6 +7229,7 @@
         <w:jc w:val="both"/>
         <w:rPr>
           <w:rFonts w:cs="Times New Roman"/>
+          <w:lang w:val="ru-RU"/>
         </w:rPr>
       </w:pPr>
     </w:p>
@@ -7631,6 +7650,7 @@
         <w:jc w:val="both"/>
         <w:rPr>
           <w:rFonts w:cs="Times New Roman"/>
+          <w:lang w:val="ru-RU"/>
         </w:rPr>
       </w:pPr>
       <w:r>
@@ -7648,6 +7668,7 @@
         <w:jc w:val="both"/>
         <w:rPr>
           <w:rFonts w:cs="Times New Roman"/>
+          <w:lang w:val="ru-RU"/>
         </w:rPr>
       </w:pPr>
     </w:p>
@@ -7680,6 +7701,7 @@
         <w:jc w:val="both"/>
         <w:rPr>
           <w:rFonts w:cs="Times New Roman"/>
+          <w:lang w:val="ru-RU"/>
         </w:rPr>
       </w:pPr>
       <w:r>
@@ -7705,6 +7727,7 @@
         <w:jc w:val="both"/>
         <w:rPr>
           <w:rFonts w:cs="Times New Roman"/>
+          <w:lang w:val="ru-RU"/>
         </w:rPr>
       </w:pPr>
     </w:p>
@@ -8115,6 +8138,7 @@
         <w:jc w:val="both"/>
         <w:rPr>
           <w:rFonts w:cs="Times New Roman"/>
+          <w:lang w:val="ru-RU"/>
         </w:rPr>
       </w:pPr>
     </w:p>
@@ -9031,6 +9055,7 @@
         <w:jc w:val="both"/>
         <w:rPr>
           <w:rFonts w:cs="Times New Roman"/>
+          <w:lang w:val="ru-RU"/>
         </w:rPr>
       </w:pPr>
     </w:p>
@@ -9350,6 +9375,7 @@
         <w:jc w:val="both"/>
         <w:rPr>
           <w:rFonts w:cs="Times New Roman"/>
+          <w:lang w:val="ru-RU"/>
         </w:rPr>
       </w:pPr>
     </w:p>
@@ -9361,6 +9387,7 @@
         <w:rPr>
           <w:rFonts w:cs="Times New Roman"/>
           <w:u w:val="single"/>
+          <w:lang w:val="ru-RU"/>
         </w:rPr>
       </w:pPr>
       <w:r>
@@ -9592,6 +9619,7 @@
         <w:jc w:val="both"/>
         <w:rPr>
           <w:rFonts w:cs="Times New Roman"/>
+          <w:lang w:val="ru-RU"/>
         </w:rPr>
       </w:pPr>
     </w:p>
@@ -9624,6 +9652,7 @@
         <w:jc w:val="both"/>
         <w:rPr>
           <w:rFonts w:cs="Times New Roman"/>
+          <w:lang w:val="ru-RU"/>
         </w:rPr>
       </w:pPr>
       <w:r>
@@ -9641,6 +9670,7 @@
         <w:jc w:val="both"/>
         <w:rPr>
           <w:rFonts w:cs="Times New Roman"/>
+          <w:lang w:val="ru-RU"/>
         </w:rPr>
       </w:pPr>
     </w:p>
@@ -9652,6 +9682,7 @@
         <w:rPr>
           <w:rFonts w:cs="Times New Roman"/>
           <w:u w:val="single"/>
+          <w:lang w:val="ru-RU"/>
         </w:rPr>
       </w:pPr>
       <w:r>
@@ -9912,6 +9943,7 @@
         <w:jc w:val="both"/>
         <w:rPr>
           <w:rFonts w:cs="Times New Roman"/>
+          <w:lang w:val="ru-RU"/>
         </w:rPr>
       </w:pPr>
     </w:p>
@@ -10066,6 +10098,7 @@
         <w:jc w:val="both"/>
         <w:rPr>
           <w:rFonts w:cs="Times New Roman"/>
+          <w:lang w:val="ru-RU"/>
         </w:rPr>
       </w:pPr>
     </w:p>
@@ -10931,6 +10964,7 @@
         <w:jc w:val="both"/>
         <w:rPr>
           <w:rFonts w:cs="Times New Roman"/>
+          <w:lang w:val="ru-RU"/>
         </w:rPr>
       </w:pPr>
     </w:p>
@@ -24823,9 +24857,6 @@
         <w:spacing w:after="0" w:line="360" w:lineRule="auto"/>
         <w:ind w:left="0" w:firstLine="709"/>
         <w:jc w:val="both"/>
-        <w:rPr>
-          <w:lang w:val="ru-RU"/>
-        </w:rPr>
       </w:pPr>
       <w:r>
         <w:t xml:space="preserve">Ministry of Industry and Information Technology of China (MIIT). (2022). Rare Earth Industry Development Plan (2021-2035). Beijing: MIIT. [In Chinese] Retrieved from </w:t>
@@ -25127,9 +25158,6 @@
         <w:spacing w:after="0" w:line="360" w:lineRule="auto"/>
         <w:ind w:left="0" w:firstLine="709"/>
         <w:jc w:val="both"/>
-        <w:rPr>
-          <w:lang w:val="ru-RU"/>
-        </w:rPr>
       </w:pPr>
       <w:r>
         <w:t xml:space="preserve">International Energy Agency (IEA). (2021). The Role of Critical Minerals in Clean Energy Transitions. World Energy Outlook Special Report. Paris: IEA Publications. </w:t>
@@ -25380,9 +25408,6 @@
         <w:spacing w:after="0" w:line="360" w:lineRule="auto"/>
         <w:ind w:left="0" w:firstLine="709"/>
         <w:jc w:val="both"/>
-        <w:rPr>
-          <w:lang w:val="ru-RU"/>
-        </w:rPr>
       </w:pPr>
       <w:r>
         <w:t xml:space="preserve">Roskill Information Services. (2023). Rare Earths: Global Industry Markets and Outlook, 2023. London: Roskill. Retrieved from </w:t>
@@ -25406,9 +25431,6 @@
         <w:spacing w:after="0" w:line="360" w:lineRule="auto"/>
         <w:ind w:left="0" w:firstLine="709"/>
         <w:jc w:val="both"/>
-        <w:rPr>
-          <w:lang w:val="ru-RU"/>
-        </w:rPr>
       </w:pPr>
       <w:r>
         <w:lastRenderedPageBreak/>
@@ -25427,9 +25449,6 @@
       <w:pPr>
         <w:spacing w:after="0" w:line="360" w:lineRule="auto"/>
         <w:jc w:val="both"/>
-        <w:rPr>
-          <w:lang w:val="ru-RU"/>
-        </w:rPr>
       </w:pPr>
     </w:p>
     <w:p>
@@ -25972,7 +25991,6 @@
         <w:rPr>
           <w:b/>
           <w:bCs/>
-          <w:lang w:val="ru-RU"/>
         </w:rPr>
       </w:pPr>
       <w:r>
@@ -25988,14 +26006,6 @@
     <w:p>
       <w:pPr>
         <w:spacing w:line="360" w:lineRule="auto"/>
-        <w:rPr>
-          <w:lang w:val="ru-RU"/>
-        </w:rPr>
-      </w:pPr>
-    </w:p>
-    <w:p>
-      <w:pPr>
-        <w:spacing w:line="360" w:lineRule="auto"/>
         <w:jc w:val="center"/>
       </w:pPr>
       <w:r>
@@ -26003,10 +26013,10 @@
           <w:noProof/>
         </w:rPr>
         <w:drawing>
-          <wp:inline distT="0" distB="0" distL="0" distR="0" wp14:anchorId="6C64679F" wp14:editId="4A1AF95A">
-            <wp:extent cx="5486400" cy="3295650"/>
-            <wp:effectExtent l="0" t="0" r="0" b="0"/>
-            <wp:docPr id="2" name="Рисунок 2"/>
+          <wp:inline distT="0" distB="0" distL="0" distR="0" wp14:anchorId="2DB08BFA" wp14:editId="38C25072">
+            <wp:extent cx="5486400" cy="3123565"/>
+            <wp:effectExtent l="0" t="0" r="0" b="635"/>
+            <wp:docPr id="4" name="Рисунок 4"/>
             <wp:cNvGraphicFramePr>
               <a:graphicFrameLocks xmlns:a="http://schemas.openxmlformats.org/drawingml/2006/main" noChangeAspect="1"/>
             </wp:cNvGraphicFramePr>
@@ -26014,7 +26024,7 @@
               <a:graphicData uri="http://schemas.openxmlformats.org/drawingml/2006/picture">
                 <pic:pic xmlns:pic="http://schemas.openxmlformats.org/drawingml/2006/picture">
                   <pic:nvPicPr>
-                    <pic:cNvPr id="0" name="Picture 19"/>
+                    <pic:cNvPr id="0" name="Picture 1"/>
                     <pic:cNvPicPr>
                       <a:picLocks noChangeAspect="1" noChangeArrowheads="1"/>
                     </pic:cNvPicPr>
@@ -26035,7 +26045,7 @@
                   <pic:spPr bwMode="auto">
                     <a:xfrm>
                       <a:off x="0" y="0"/>
-                      <a:ext cx="5486400" cy="3295650"/>
+                      <a:ext cx="5486400" cy="3123565"/>
                     </a:xfrm>
                     <a:prstGeom prst="rect">
                       <a:avLst/>
@@ -26057,26 +26067,34 @@
         <w:spacing w:line="360" w:lineRule="auto"/>
         <w:jc w:val="center"/>
         <w:rPr>
+          <w:sz w:val="24"/>
+          <w:szCs w:val="24"/>
+          <w:lang w:val="ru-RU"/>
+        </w:rPr>
+      </w:pPr>
+      <w:r>
+        <w:rPr>
+          <w:rFonts w:ascii="Segoe UI Emoji" w:hAnsi="Segoe UI Emoji" w:cs="Segoe UI Emoji"/>
           <w:b/>
           <w:bCs/>
           <w:i/>
           <w:iCs/>
           <w:sz w:val="24"/>
           <w:szCs w:val="24"/>
-          <w:lang w:val="ru-RU"/>
-        </w:rPr>
-      </w:pPr>
-      <w:r>
-        <w:rPr>
-          <w:rFonts w:ascii="Segoe UI Emoji" w:hAnsi="Segoe UI Emoji" w:cs="Segoe UI Emoji"/>
+        </w:rPr>
+        <w:t>📈</w:t>
+      </w:r>
+      <w:r>
+        <w:rPr>
           <w:b/>
           <w:bCs/>
           <w:i/>
           <w:iCs/>
           <w:sz w:val="24"/>
           <w:szCs w:val="24"/>
-        </w:rPr>
-        <w:t>📈</w:t>
+          <w:lang w:val="ru-RU"/>
+        </w:rPr>
+        <w:t xml:space="preserve"> График </w:t>
       </w:r>
       <w:r>
         <w:rPr>
@@ -26088,7 +26106,7 @@
           <w:szCs w:val="24"/>
           <w:lang w:val="ru-RU"/>
         </w:rPr>
-        <w:t xml:space="preserve"> График </w:t>
+        <w:t>№</w:t>
       </w:r>
       <w:r>
         <w:rPr>
@@ -26100,7 +26118,7 @@
           <w:szCs w:val="24"/>
           <w:lang w:val="ru-RU"/>
         </w:rPr>
-        <w:t>№</w:t>
+        <w:t xml:space="preserve">1: </w:t>
       </w:r>
       <w:r>
         <w:rPr>
@@ -26112,213 +26130,25 @@
           <w:szCs w:val="24"/>
           <w:lang w:val="ru-RU"/>
         </w:rPr>
-        <w:t>1: Распространённость платформ</w:t>
+        <w:t>Динамика мирового производства и потребления РЗМ</w:t>
       </w:r>
     </w:p>
     <w:p>
       <w:pPr>
         <w:spacing w:line="360" w:lineRule="auto"/>
         <w:rPr>
-          <w:b/>
-          <w:bCs/>
-          <w:i/>
-          <w:iCs/>
           <w:sz w:val="24"/>
           <w:szCs w:val="24"/>
-          <w:lang w:val="ru-RU"/>
-        </w:rPr>
-      </w:pPr>
-    </w:p>
-    <w:p>
-      <w:pPr>
-        <w:spacing w:after="0" w:line="360" w:lineRule="auto"/>
-        <w:ind w:firstLine="709"/>
-        <w:jc w:val="both"/>
-        <w:rPr>
-          <w:i/>
-          <w:iCs/>
+        </w:rPr>
+      </w:pPr>
+    </w:p>
+    <w:p>
+      <w:pPr>
+        <w:spacing w:line="360" w:lineRule="auto"/>
+        <w:jc w:val="center"/>
+        <w:rPr>
           <w:sz w:val="24"/>
           <w:szCs w:val="24"/>
-          <w:lang w:val="ru-RU"/>
-        </w:rPr>
-      </w:pPr>
-      <w:r>
-        <w:rPr>
-          <w:i/>
-          <w:iCs/>
-          <w:sz w:val="24"/>
-          <w:szCs w:val="24"/>
-          <w:lang w:val="ru-RU"/>
-        </w:rPr>
-        <w:t>Диаграмма отражает долю студентов российских вузов, использующих различные цифровые платформы для образовательных целей в условиях локализации образовательного контента.</w:t>
-      </w:r>
-    </w:p>
-    <w:p>
-      <w:pPr>
-        <w:spacing w:after="0" w:line="360" w:lineRule="auto"/>
-        <w:ind w:firstLine="709"/>
-        <w:jc w:val="both"/>
-        <w:rPr>
-          <w:i/>
-          <w:iCs/>
-          <w:sz w:val="24"/>
-          <w:szCs w:val="24"/>
-          <w:lang w:val="ru-RU"/>
-        </w:rPr>
-      </w:pPr>
-      <w:r>
-        <w:rPr>
-          <w:i/>
-          <w:iCs/>
-          <w:sz w:val="24"/>
-          <w:szCs w:val="24"/>
-        </w:rPr>
-        <w:t>Telegram</w:t>
-      </w:r>
-      <w:r>
-        <w:rPr>
-          <w:i/>
-          <w:iCs/>
-          <w:sz w:val="24"/>
-          <w:szCs w:val="24"/>
-          <w:lang w:val="ru-RU"/>
-        </w:rPr>
-        <w:t xml:space="preserve"> демонстрирует наибольшую вовлечённость (89%), что обусловлено удобством мгновенного обмена материалами, низким порогом входа и независимостью от специального оборудования.</w:t>
-      </w:r>
-    </w:p>
-    <w:p>
-      <w:pPr>
-        <w:spacing w:after="0" w:line="360" w:lineRule="auto"/>
-        <w:ind w:firstLine="709"/>
-        <w:jc w:val="both"/>
-        <w:rPr>
-          <w:i/>
-          <w:iCs/>
-          <w:sz w:val="24"/>
-          <w:szCs w:val="24"/>
-          <w:lang w:val="ru-RU"/>
-        </w:rPr>
-      </w:pPr>
-      <w:r>
-        <w:rPr>
-          <w:i/>
-          <w:iCs/>
-          <w:sz w:val="24"/>
-          <w:szCs w:val="24"/>
-          <w:lang w:val="ru-RU"/>
-        </w:rPr>
-        <w:t>ВКонтакте занимает второе место (63%) благодаря возможности структурирования контента через создание групп курсов и встроенные функции совместной работы.</w:t>
-      </w:r>
-    </w:p>
-    <w:p>
-      <w:pPr>
-        <w:spacing w:after="0" w:line="360" w:lineRule="auto"/>
-        <w:ind w:firstLine="709"/>
-        <w:jc w:val="both"/>
-        <w:rPr>
-          <w:i/>
-          <w:iCs/>
-          <w:sz w:val="24"/>
-          <w:szCs w:val="24"/>
-          <w:lang w:val="ru-RU"/>
-        </w:rPr>
-      </w:pPr>
-      <w:r>
-        <w:rPr>
-          <w:i/>
-          <w:iCs/>
-          <w:sz w:val="24"/>
-          <w:szCs w:val="24"/>
-        </w:rPr>
-        <w:t>Discord</w:t>
-      </w:r>
-      <w:r>
-        <w:rPr>
-          <w:i/>
-          <w:iCs/>
-          <w:sz w:val="24"/>
-          <w:szCs w:val="24"/>
-          <w:lang w:val="ru-RU"/>
-        </w:rPr>
-        <w:t>, используемый 41% студентов до блокировки в октябре 2024 года, был популярен для синхронного общения в реальном времени.</w:t>
-      </w:r>
-    </w:p>
-    <w:p>
-      <w:pPr>
-        <w:spacing w:after="0" w:line="360" w:lineRule="auto"/>
-        <w:ind w:firstLine="709"/>
-        <w:jc w:val="both"/>
-        <w:rPr>
-          <w:i/>
-          <w:iCs/>
-          <w:sz w:val="24"/>
-          <w:szCs w:val="24"/>
-          <w:lang w:val="ru-RU"/>
-        </w:rPr>
-      </w:pPr>
-      <w:r>
-        <w:rPr>
-          <w:b/>
-          <w:bCs/>
-          <w:i/>
-          <w:iCs/>
-          <w:sz w:val="24"/>
-          <w:szCs w:val="24"/>
-          <w:lang w:val="ru-RU"/>
-        </w:rPr>
-        <w:lastRenderedPageBreak/>
-        <w:t xml:space="preserve">Данные подтверждают доминирование национальных и локализованных платформ в образовательном процессе в условиях технологической </w:t>
-      </w:r>
-      <w:r>
-        <w:rPr>
-          <w:b/>
-          <w:bCs/>
-          <w:i/>
-          <w:iCs/>
-          <w:sz w:val="24"/>
-          <w:szCs w:val="24"/>
-          <w:lang w:val="ru-RU"/>
-        </w:rPr>
-        <w:t>автономии</w:t>
-      </w:r>
-      <w:r>
-        <w:rPr>
-          <w:b/>
-          <w:bCs/>
-          <w:i/>
-          <w:iCs/>
-          <w:sz w:val="24"/>
-          <w:szCs w:val="24"/>
-          <w:lang w:val="ru-RU"/>
-        </w:rPr>
-        <w:t>.</w:t>
-      </w:r>
-    </w:p>
-    <w:p>
-      <w:pPr>
-        <w:spacing w:after="0" w:line="360" w:lineRule="auto"/>
-        <w:jc w:val="both"/>
-        <w:rPr>
-          <w:i/>
-          <w:iCs/>
-          <w:sz w:val="24"/>
-          <w:szCs w:val="24"/>
-          <w:lang w:val="ru-RU"/>
-        </w:rPr>
-      </w:pPr>
-    </w:p>
-    <w:p>
-      <w:pPr>
-        <w:spacing w:line="360" w:lineRule="auto"/>
-        <w:jc w:val="center"/>
-        <w:rPr>
-          <w:b/>
-          <w:bCs/>
-          <w:i/>
-          <w:iCs/>
-          <w:sz w:val="24"/>
-          <w:szCs w:val="24"/>
-          <w:lang w:val="ru-RU"/>
         </w:rPr>
       </w:pPr>
       <w:r>
@@ -26326,10 +26156,10 @@
           <w:noProof/>
         </w:rPr>
         <w:drawing>
-          <wp:inline distT="0" distB="0" distL="0" distR="0" wp14:anchorId="0B8FB166" wp14:editId="5D409D16">
-            <wp:extent cx="5486400" cy="4893945"/>
-            <wp:effectExtent l="0" t="0" r="0" b="1905"/>
-            <wp:docPr id="3" name="Рисунок 3"/>
+          <wp:inline distT="0" distB="0" distL="0" distR="0" wp14:anchorId="1B32B7BF" wp14:editId="0C75C154">
+            <wp:extent cx="5486400" cy="3323590"/>
+            <wp:effectExtent l="0" t="0" r="0" b="0"/>
+            <wp:docPr id="5" name="Рисунок 5"/>
             <wp:cNvGraphicFramePr>
               <a:graphicFrameLocks xmlns:a="http://schemas.openxmlformats.org/drawingml/2006/main" noChangeAspect="1"/>
             </wp:cNvGraphicFramePr>
@@ -26337,7 +26167,7 @@
               <a:graphicData uri="http://schemas.openxmlformats.org/drawingml/2006/picture">
                 <pic:pic xmlns:pic="http://schemas.openxmlformats.org/drawingml/2006/picture">
                   <pic:nvPicPr>
-                    <pic:cNvPr id="0" name="Picture 21"/>
+                    <pic:cNvPr id="0" name="Picture 3"/>
                     <pic:cNvPicPr>
                       <a:picLocks noChangeAspect="1" noChangeArrowheads="1"/>
                     </pic:cNvPicPr>
@@ -26358,7 +26188,7 @@
                   <pic:spPr bwMode="auto">
                     <a:xfrm>
                       <a:off x="0" y="0"/>
-                      <a:ext cx="5486400" cy="4893945"/>
+                      <a:ext cx="5486400" cy="3323590"/>
                     </a:xfrm>
                     <a:prstGeom prst="rect">
                       <a:avLst/>
@@ -26380,15 +26210,24 @@
         <w:spacing w:line="360" w:lineRule="auto"/>
         <w:jc w:val="center"/>
         <w:rPr>
+          <w:sz w:val="24"/>
+          <w:szCs w:val="24"/>
+          <w:lang w:val="ru-RU"/>
+        </w:rPr>
+      </w:pPr>
+      <w:r>
+        <w:rPr>
+          <w:rFonts w:ascii="Segoe UI Emoji" w:hAnsi="Segoe UI Emoji" w:cs="Segoe UI Emoji"/>
           <w:b/>
           <w:bCs/>
           <w:i/>
           <w:iCs/>
           <w:sz w:val="24"/>
           <w:szCs w:val="24"/>
-          <w:lang w:val="ru-RU"/>
-        </w:rPr>
-      </w:pPr>
+        </w:rPr>
+        <w:lastRenderedPageBreak/>
+        <w:t>📈</w:t>
+      </w:r>
       <w:r>
         <w:rPr>
           <w:b/>
@@ -26399,7 +26238,7 @@
           <w:szCs w:val="24"/>
           <w:lang w:val="ru-RU"/>
         </w:rPr>
-        <w:t xml:space="preserve">График </w:t>
+        <w:t xml:space="preserve"> График </w:t>
       </w:r>
       <w:r>
         <w:rPr>
@@ -26423,9 +26262,8 @@
           <w:szCs w:val="24"/>
           <w:lang w:val="ru-RU"/>
         </w:rPr>
-        <w:t xml:space="preserve">2: Сравнение методик — Россия </w:t>
-      </w:r>
-      <w:proofErr w:type="spellStart"/>
+        <w:t>2</w:t>
+      </w:r>
       <w:r>
         <w:rPr>
           <w:b/>
@@ -26436,9 +26274,8 @@
           <w:szCs w:val="24"/>
           <w:lang w:val="ru-RU"/>
         </w:rPr>
-        <w:t>vs</w:t>
-      </w:r>
-      <w:proofErr w:type="spellEnd"/>
+        <w:t xml:space="preserve">: </w:t>
+      </w:r>
       <w:r>
         <w:rPr>
           <w:b/>
@@ -26449,8 +26286,481 @@
           <w:szCs w:val="24"/>
           <w:lang w:val="ru-RU"/>
         </w:rPr>
-        <w:t xml:space="preserve"> Китай (Радар)</w:t>
-      </w:r>
+        <w:t>Структура потребления РЗМ по областям применения</w:t>
+      </w:r>
+    </w:p>
+    <w:p>
+      <w:pPr>
+        <w:spacing w:line="360" w:lineRule="auto"/>
+        <w:rPr>
+          <w:sz w:val="24"/>
+          <w:szCs w:val="24"/>
+        </w:rPr>
+      </w:pPr>
+    </w:p>
+    <w:p>
+      <w:pPr>
+        <w:spacing w:line="360" w:lineRule="auto"/>
+        <w:jc w:val="center"/>
+        <w:rPr>
+          <w:sz w:val="24"/>
+          <w:szCs w:val="24"/>
+        </w:rPr>
+      </w:pPr>
+      <w:r>
+        <w:rPr>
+          <w:noProof/>
+        </w:rPr>
+        <w:drawing>
+          <wp:inline distT="0" distB="0" distL="0" distR="0" wp14:anchorId="0D254753" wp14:editId="0A742584">
+            <wp:extent cx="5486400" cy="3143885"/>
+            <wp:effectExtent l="0" t="0" r="0" b="0"/>
+            <wp:docPr id="6" name="Рисунок 6"/>
+            <wp:cNvGraphicFramePr>
+              <a:graphicFrameLocks xmlns:a="http://schemas.openxmlformats.org/drawingml/2006/main" noChangeAspect="1"/>
+            </wp:cNvGraphicFramePr>
+            <a:graphic xmlns:a="http://schemas.openxmlformats.org/drawingml/2006/main">
+              <a:graphicData uri="http://schemas.openxmlformats.org/drawingml/2006/picture">
+                <pic:pic xmlns:pic="http://schemas.openxmlformats.org/drawingml/2006/picture">
+                  <pic:nvPicPr>
+                    <pic:cNvPr id="0" name="Picture 5"/>
+                    <pic:cNvPicPr>
+                      <a:picLocks noChangeAspect="1" noChangeArrowheads="1"/>
+                    </pic:cNvPicPr>
+                  </pic:nvPicPr>
+                  <pic:blipFill>
+                    <a:blip r:embed="rId41">
+                      <a:extLst>
+                        <a:ext uri="{28A0092B-C50C-407E-A947-70E740481C1C}">
+                          <a14:useLocalDpi xmlns:a14="http://schemas.microsoft.com/office/drawing/2010/main" val="0"/>
+                        </a:ext>
+                      </a:extLst>
+                    </a:blip>
+                    <a:srcRect/>
+                    <a:stretch>
+                      <a:fillRect/>
+                    </a:stretch>
+                  </pic:blipFill>
+                  <pic:spPr bwMode="auto">
+                    <a:xfrm>
+                      <a:off x="0" y="0"/>
+                      <a:ext cx="5486400" cy="3143885"/>
+                    </a:xfrm>
+                    <a:prstGeom prst="rect">
+                      <a:avLst/>
+                    </a:prstGeom>
+                    <a:noFill/>
+                    <a:ln>
+                      <a:noFill/>
+                    </a:ln>
+                  </pic:spPr>
+                </pic:pic>
+              </a:graphicData>
+            </a:graphic>
+          </wp:inline>
+        </w:drawing>
+      </w:r>
+    </w:p>
+    <w:p>
+      <w:pPr>
+        <w:spacing w:line="360" w:lineRule="auto"/>
+        <w:jc w:val="center"/>
+        <w:rPr>
+          <w:sz w:val="24"/>
+          <w:szCs w:val="24"/>
+        </w:rPr>
+      </w:pPr>
+      <w:r>
+        <w:rPr>
+          <w:rFonts w:ascii="Segoe UI Emoji" w:hAnsi="Segoe UI Emoji" w:cs="Segoe UI Emoji"/>
+          <w:b/>
+          <w:bCs/>
+          <w:i/>
+          <w:iCs/>
+          <w:sz w:val="24"/>
+          <w:szCs w:val="24"/>
+        </w:rPr>
+        <w:t>📈</w:t>
+      </w:r>
+      <w:r>
+        <w:rPr>
+          <w:b/>
+          <w:bCs/>
+          <w:i/>
+          <w:iCs/>
+          <w:sz w:val="24"/>
+          <w:szCs w:val="24"/>
+          <w:lang w:val="ru-RU"/>
+        </w:rPr>
+        <w:t xml:space="preserve"> График </w:t>
+      </w:r>
+      <w:r>
+        <w:rPr>
+          <w:b/>
+          <w:bCs/>
+          <w:i/>
+          <w:iCs/>
+          <w:sz w:val="24"/>
+          <w:szCs w:val="24"/>
+          <w:lang w:val="ru-RU"/>
+        </w:rPr>
+        <w:t>№</w:t>
+      </w:r>
+      <w:r>
+        <w:rPr>
+          <w:b/>
+          <w:bCs/>
+          <w:i/>
+          <w:iCs/>
+          <w:sz w:val="24"/>
+          <w:szCs w:val="24"/>
+          <w:lang w:val="ru-RU"/>
+        </w:rPr>
+        <w:t>3</w:t>
+      </w:r>
+      <w:r>
+        <w:rPr>
+          <w:b/>
+          <w:bCs/>
+          <w:i/>
+          <w:iCs/>
+          <w:sz w:val="24"/>
+          <w:szCs w:val="24"/>
+          <w:lang w:val="ru-RU"/>
+        </w:rPr>
+        <w:t xml:space="preserve">: </w:t>
+      </w:r>
+      <w:r>
+        <w:rPr>
+          <w:b/>
+          <w:bCs/>
+          <w:i/>
+          <w:iCs/>
+          <w:sz w:val="24"/>
+          <w:szCs w:val="24"/>
+          <w:lang w:val="ru-RU"/>
+        </w:rPr>
+        <w:t>Географическая концентрация производства РЗМ</w:t>
+      </w:r>
+    </w:p>
+    <w:p>
+      <w:pPr>
+        <w:spacing w:line="360" w:lineRule="auto"/>
+        <w:rPr>
+          <w:sz w:val="24"/>
+          <w:szCs w:val="24"/>
+        </w:rPr>
+      </w:pPr>
+    </w:p>
+    <w:p>
+      <w:pPr>
+        <w:spacing w:line="360" w:lineRule="auto"/>
+        <w:jc w:val="center"/>
+        <w:rPr>
+          <w:sz w:val="24"/>
+          <w:szCs w:val="24"/>
+          <w:lang w:val="ru-RU"/>
+        </w:rPr>
+      </w:pPr>
+      <w:r>
+        <w:rPr>
+          <w:noProof/>
+        </w:rPr>
+        <w:drawing>
+          <wp:inline distT="0" distB="0" distL="0" distR="0" wp14:anchorId="789FEB88" wp14:editId="1E093C03">
+            <wp:extent cx="5486400" cy="3118485"/>
+            <wp:effectExtent l="0" t="0" r="0" b="5715"/>
+            <wp:docPr id="7" name="Рисунок 7"/>
+            <wp:cNvGraphicFramePr>
+              <a:graphicFrameLocks xmlns:a="http://schemas.openxmlformats.org/drawingml/2006/main" noChangeAspect="1"/>
+            </wp:cNvGraphicFramePr>
+            <a:graphic xmlns:a="http://schemas.openxmlformats.org/drawingml/2006/main">
+              <a:graphicData uri="http://schemas.openxmlformats.org/drawingml/2006/picture">
+                <pic:pic xmlns:pic="http://schemas.openxmlformats.org/drawingml/2006/picture">
+                  <pic:nvPicPr>
+                    <pic:cNvPr id="0" name="Picture 7"/>
+                    <pic:cNvPicPr>
+                      <a:picLocks noChangeAspect="1" noChangeArrowheads="1"/>
+                    </pic:cNvPicPr>
+                  </pic:nvPicPr>
+                  <pic:blipFill>
+                    <a:blip r:embed="rId42">
+                      <a:extLst>
+                        <a:ext uri="{28A0092B-C50C-407E-A947-70E740481C1C}">
+                          <a14:useLocalDpi xmlns:a14="http://schemas.microsoft.com/office/drawing/2010/main" val="0"/>
+                        </a:ext>
+                      </a:extLst>
+                    </a:blip>
+                    <a:srcRect/>
+                    <a:stretch>
+                      <a:fillRect/>
+                    </a:stretch>
+                  </pic:blipFill>
+                  <pic:spPr bwMode="auto">
+                    <a:xfrm>
+                      <a:off x="0" y="0"/>
+                      <a:ext cx="5486400" cy="3118485"/>
+                    </a:xfrm>
+                    <a:prstGeom prst="rect">
+                      <a:avLst/>
+                    </a:prstGeom>
+                    <a:noFill/>
+                    <a:ln>
+                      <a:noFill/>
+                    </a:ln>
+                  </pic:spPr>
+                </pic:pic>
+              </a:graphicData>
+            </a:graphic>
+          </wp:inline>
+        </w:drawing>
+      </w:r>
+    </w:p>
+    <w:p>
+      <w:pPr>
+        <w:spacing w:line="360" w:lineRule="auto"/>
+        <w:jc w:val="center"/>
+        <w:rPr>
+          <w:sz w:val="24"/>
+          <w:szCs w:val="24"/>
+        </w:rPr>
+      </w:pPr>
+      <w:r>
+        <w:rPr>
+          <w:rFonts w:ascii="Segoe UI Emoji" w:hAnsi="Segoe UI Emoji" w:cs="Segoe UI Emoji"/>
+          <w:b/>
+          <w:bCs/>
+          <w:i/>
+          <w:iCs/>
+          <w:sz w:val="24"/>
+          <w:szCs w:val="24"/>
+        </w:rPr>
+        <w:lastRenderedPageBreak/>
+        <w:t>📈</w:t>
+      </w:r>
+      <w:r>
+        <w:rPr>
+          <w:b/>
+          <w:bCs/>
+          <w:i/>
+          <w:iCs/>
+          <w:sz w:val="24"/>
+          <w:szCs w:val="24"/>
+          <w:lang w:val="ru-RU"/>
+        </w:rPr>
+        <w:t xml:space="preserve"> График </w:t>
+      </w:r>
+      <w:r>
+        <w:rPr>
+          <w:b/>
+          <w:bCs/>
+          <w:i/>
+          <w:iCs/>
+          <w:sz w:val="24"/>
+          <w:szCs w:val="24"/>
+          <w:lang w:val="ru-RU"/>
+        </w:rPr>
+        <w:t>№</w:t>
+      </w:r>
+      <w:r>
+        <w:rPr>
+          <w:b/>
+          <w:bCs/>
+          <w:i/>
+          <w:iCs/>
+          <w:sz w:val="24"/>
+          <w:szCs w:val="24"/>
+          <w:lang w:val="ru-RU"/>
+        </w:rPr>
+        <w:t>4</w:t>
+      </w:r>
+      <w:r>
+        <w:rPr>
+          <w:b/>
+          <w:bCs/>
+          <w:i/>
+          <w:iCs/>
+          <w:sz w:val="24"/>
+          <w:szCs w:val="24"/>
+          <w:lang w:val="ru-RU"/>
+        </w:rPr>
+        <w:t xml:space="preserve">: </w:t>
+      </w:r>
+      <w:r>
+        <w:rPr>
+          <w:b/>
+          <w:bCs/>
+          <w:i/>
+          <w:iCs/>
+          <w:sz w:val="24"/>
+          <w:szCs w:val="24"/>
+          <w:lang w:val="ru-RU"/>
+        </w:rPr>
+        <w:t>Ценовая волатильность критических РЗМ</w:t>
+      </w:r>
+    </w:p>
+    <w:p>
+      <w:pPr>
+        <w:spacing w:line="360" w:lineRule="auto"/>
+        <w:rPr>
+          <w:sz w:val="24"/>
+          <w:szCs w:val="24"/>
+        </w:rPr>
+      </w:pPr>
+    </w:p>
+    <w:p>
+      <w:pPr>
+        <w:spacing w:line="360" w:lineRule="auto"/>
+        <w:jc w:val="center"/>
+        <w:rPr>
+          <w:sz w:val="24"/>
+          <w:szCs w:val="24"/>
+        </w:rPr>
+      </w:pPr>
+      <w:r>
+        <w:rPr>
+          <w:noProof/>
+        </w:rPr>
+        <w:drawing>
+          <wp:inline distT="0" distB="0" distL="0" distR="0" wp14:anchorId="12668EAD" wp14:editId="21DE9259">
+            <wp:extent cx="5486400" cy="3766185"/>
+            <wp:effectExtent l="0" t="0" r="0" b="5715"/>
+            <wp:docPr id="8" name="Рисунок 8"/>
+            <wp:cNvGraphicFramePr>
+              <a:graphicFrameLocks xmlns:a="http://schemas.openxmlformats.org/drawingml/2006/main" noChangeAspect="1"/>
+            </wp:cNvGraphicFramePr>
+            <a:graphic xmlns:a="http://schemas.openxmlformats.org/drawingml/2006/main">
+              <a:graphicData uri="http://schemas.openxmlformats.org/drawingml/2006/picture">
+                <pic:pic xmlns:pic="http://schemas.openxmlformats.org/drawingml/2006/picture">
+                  <pic:nvPicPr>
+                    <pic:cNvPr id="0" name="Picture 9"/>
+                    <pic:cNvPicPr>
+                      <a:picLocks noChangeAspect="1" noChangeArrowheads="1"/>
+                    </pic:cNvPicPr>
+                  </pic:nvPicPr>
+                  <pic:blipFill>
+                    <a:blip r:embed="rId43">
+                      <a:extLst>
+                        <a:ext uri="{28A0092B-C50C-407E-A947-70E740481C1C}">
+                          <a14:useLocalDpi xmlns:a14="http://schemas.microsoft.com/office/drawing/2010/main" val="0"/>
+                        </a:ext>
+                      </a:extLst>
+                    </a:blip>
+                    <a:srcRect/>
+                    <a:stretch>
+                      <a:fillRect/>
+                    </a:stretch>
+                  </pic:blipFill>
+                  <pic:spPr bwMode="auto">
+                    <a:xfrm>
+                      <a:off x="0" y="0"/>
+                      <a:ext cx="5486400" cy="3766185"/>
+                    </a:xfrm>
+                    <a:prstGeom prst="rect">
+                      <a:avLst/>
+                    </a:prstGeom>
+                    <a:noFill/>
+                    <a:ln>
+                      <a:noFill/>
+                    </a:ln>
+                  </pic:spPr>
+                </pic:pic>
+              </a:graphicData>
+            </a:graphic>
+          </wp:inline>
+        </w:drawing>
+      </w:r>
+    </w:p>
+    <w:p>
+      <w:pPr>
+        <w:spacing w:line="360" w:lineRule="auto"/>
+        <w:jc w:val="center"/>
+        <w:rPr>
+          <w:sz w:val="24"/>
+          <w:szCs w:val="24"/>
+        </w:rPr>
+      </w:pPr>
+      <w:r>
+        <w:rPr>
+          <w:rFonts w:ascii="Segoe UI Emoji" w:hAnsi="Segoe UI Emoji" w:cs="Segoe UI Emoji"/>
+          <w:b/>
+          <w:bCs/>
+          <w:i/>
+          <w:iCs/>
+          <w:sz w:val="24"/>
+          <w:szCs w:val="24"/>
+        </w:rPr>
+        <w:t>📈</w:t>
+      </w:r>
+      <w:r>
+        <w:rPr>
+          <w:b/>
+          <w:bCs/>
+          <w:i/>
+          <w:iCs/>
+          <w:sz w:val="24"/>
+          <w:szCs w:val="24"/>
+          <w:lang w:val="ru-RU"/>
+        </w:rPr>
+        <w:t xml:space="preserve"> График </w:t>
+      </w:r>
+      <w:r>
+        <w:rPr>
+          <w:b/>
+          <w:bCs/>
+          <w:i/>
+          <w:iCs/>
+          <w:sz w:val="24"/>
+          <w:szCs w:val="24"/>
+          <w:lang w:val="ru-RU"/>
+        </w:rPr>
+        <w:t>№</w:t>
+      </w:r>
+      <w:r>
+        <w:rPr>
+          <w:b/>
+          <w:bCs/>
+          <w:i/>
+          <w:iCs/>
+          <w:sz w:val="24"/>
+          <w:szCs w:val="24"/>
+          <w:lang w:val="ru-RU"/>
+        </w:rPr>
+        <w:t>5</w:t>
+      </w:r>
+      <w:r>
+        <w:rPr>
+          <w:b/>
+          <w:bCs/>
+          <w:i/>
+          <w:iCs/>
+          <w:sz w:val="24"/>
+          <w:szCs w:val="24"/>
+          <w:lang w:val="ru-RU"/>
+        </w:rPr>
+        <w:t xml:space="preserve">: </w:t>
+      </w:r>
+      <w:r>
+        <w:rPr>
+          <w:b/>
+          <w:bCs/>
+          <w:i/>
+          <w:iCs/>
+          <w:sz w:val="24"/>
+          <w:szCs w:val="24"/>
+          <w:lang w:val="ru-RU"/>
+        </w:rPr>
+        <w:t>Потребление неодима по секторам</w:t>
+      </w:r>
+    </w:p>
+    <w:p>
+      <w:pPr>
+        <w:spacing w:line="360" w:lineRule="auto"/>
+        <w:rPr>
+          <w:sz w:val="24"/>
+          <w:szCs w:val="24"/>
+        </w:rPr>
+      </w:pPr>
     </w:p>
     <w:sectPr>
       <w:pgSz w:w="12240" w:h="15840"/>
@@ -49794,7 +50104,7 @@
   <w:style w:type="paragraph" w:default="1" w:styleId="a1">
     <w:name w:val="Normal"/>
     <w:qFormat/>
-    <w:rsid w:val="00E72BA9"/>
+    <w:rsid w:val="00187E23"/>
     <w:rPr>
       <w:rFonts w:ascii="Times New Roman" w:eastAsia="Times New Roman" w:hAnsi="Times New Roman"/>
       <w:sz w:val="28"/>

</xml_diff>